<commit_message>
Fill in ONSITE prices and totals for Ustyurt GCC commercial proposal
Prices from the user's edited KP draft; line amounts and grand total
computed in both the KP letter and the RFQ form. Items 13 and 15 are
quoted as minimum ("от") prices.

Co-Authored-By: Claude Opus 5.5 <noreply@anthropic.com>
Claude-Session: https://claude.ai/code/session_019mmT6m1RtMJfg2hsA8Js6E
</commit_message>
<xml_diff>
--- a/KP/ONSITE_Ustyurt_GCC/KP_ONSITE_Ustyurt_GCC.docx
+++ b/KP/ONSITE_Ustyurt_GCC/KP_ONSITE_Ustyurt_GCC.docx
@@ -129,7 +129,7 @@
     <w:tbl>
       <w:tblPr>
         <w:tblStyle w:val="TableGrid"/>
-        <w:tblW w:type="dxa" w:w="10205"/>
+        <w:tblW w:type="dxa" w:w="10034"/>
         <w:jc w:val="center"/>
         <w:tblLayout w:type="fixed"/>
         <w:tblLook w:firstColumn="1" w:firstRow="1" w:lastColumn="0" w:lastRow="0" w:noHBand="0" w:noVBand="1" w:val="04A0"/>
@@ -137,12 +137,12 @@
       </w:tblPr>
       <w:tblGrid>
         <w:gridCol w:w="624"/>
-        <w:gridCol w:w="3628"/>
-        <w:gridCol w:w="1361"/>
+        <w:gridCol w:w="3061"/>
+        <w:gridCol w:w="1247"/>
         <w:gridCol w:w="794"/>
-        <w:gridCol w:w="1134"/>
-        <w:gridCol w:w="1247"/>
-        <w:gridCol w:w="1417"/>
+        <w:gridCol w:w="1077"/>
+        <w:gridCol w:w="1474"/>
+        <w:gridCol w:w="1757"/>
       </w:tblGrid>
       <w:tr>
         <w:trPr>
@@ -169,7 +169,7 @@
         </w:tc>
         <w:tc>
           <w:tcPr>
-            <w:tcW w:type="dxa" w:w="3628"/>
+            <w:tcW w:type="dxa" w:w="3061"/>
             <w:vAlign w:val="top"/>
           </w:tcPr>
           <w:p>
@@ -187,7 +187,7 @@
         </w:tc>
         <w:tc>
           <w:tcPr>
-            <w:tcW w:type="dxa" w:w="1361"/>
+            <w:tcW w:type="dxa" w:w="1247"/>
             <w:vAlign w:val="top"/>
           </w:tcPr>
           <w:p>
@@ -223,7 +223,7 @@
         </w:tc>
         <w:tc>
           <w:tcPr>
-            <w:tcW w:type="dxa" w:w="1134"/>
+            <w:tcW w:type="dxa" w:w="1077"/>
             <w:vAlign w:val="top"/>
           </w:tcPr>
           <w:p>
@@ -241,7 +241,7 @@
         </w:tc>
         <w:tc>
           <w:tcPr>
-            <w:tcW w:type="dxa" w:w="1247"/>
+            <w:tcW w:type="dxa" w:w="1474"/>
             <w:vAlign w:val="top"/>
           </w:tcPr>
           <w:p>
@@ -259,7 +259,7 @@
         </w:tc>
         <w:tc>
           <w:tcPr>
-            <w:tcW w:type="dxa" w:w="1417"/>
+            <w:tcW w:type="dxa" w:w="1757"/>
             <w:vAlign w:val="top"/>
           </w:tcPr>
           <w:p>
@@ -282,7 +282,7 @@
         </w:trPr>
         <w:tc>
           <w:tcPr>
-            <w:tcW w:type="dxa" w:w="1417"/>
+            <w:tcW w:type="dxa" w:w="1757"/>
             <w:gridSpan w:val="7"/>
             <w:vAlign w:val="top"/>
             <w:shd w:val="clear" w:color="auto" w:fill="F2F2F2"/>
@@ -325,7 +325,7 @@
         </w:tc>
         <w:tc>
           <w:tcPr>
-            <w:tcW w:type="dxa" w:w="3628"/>
+            <w:tcW w:type="dxa" w:w="3061"/>
             <w:vAlign w:val="top"/>
           </w:tcPr>
           <w:p>
@@ -337,13 +337,13 @@
                 <w:b w:val="0"/>
                 <w:sz w:val="20"/>
               </w:rPr>
-              <w:t>Антискалант для мембран ОО CLEAN RO-1</w:t>
+              <w:t>Антискалант для мембран CLEAN RO-1</w:t>
             </w:r>
           </w:p>
         </w:tc>
         <w:tc>
           <w:tcPr>
-            <w:tcW w:type="dxa" w:w="1361"/>
+            <w:tcW w:type="dxa" w:w="1247"/>
             <w:vAlign w:val="top"/>
           </w:tcPr>
           <w:p>
@@ -379,7 +379,7 @@
         </w:tc>
         <w:tc>
           <w:tcPr>
-            <w:tcW w:type="dxa" w:w="1134"/>
+            <w:tcW w:type="dxa" w:w="1077"/>
             <w:vAlign w:val="top"/>
           </w:tcPr>
           <w:p>
@@ -398,7 +398,7 @@
         </w:tc>
         <w:tc>
           <w:tcPr>
-            <w:tcW w:type="dxa" w:w="1247"/>
+            <w:tcW w:type="dxa" w:w="1474"/>
             <w:vAlign w:val="top"/>
           </w:tcPr>
           <w:p>
@@ -417,7 +417,7 @@
         </w:tc>
         <w:tc>
           <w:tcPr>
-            <w:tcW w:type="dxa" w:w="1417"/>
+            <w:tcW w:type="dxa" w:w="1757"/>
             <w:vAlign w:val="top"/>
           </w:tcPr>
           <w:p>
@@ -459,7 +459,7 @@
         </w:tc>
         <w:tc>
           <w:tcPr>
-            <w:tcW w:type="dxa" w:w="3628"/>
+            <w:tcW w:type="dxa" w:w="3061"/>
             <w:vAlign w:val="top"/>
           </w:tcPr>
           <w:p>
@@ -477,7 +477,7 @@
         </w:tc>
         <w:tc>
           <w:tcPr>
-            <w:tcW w:type="dxa" w:w="1361"/>
+            <w:tcW w:type="dxa" w:w="1247"/>
             <w:vAlign w:val="top"/>
           </w:tcPr>
           <w:p>
@@ -513,7 +513,7 @@
         </w:tc>
         <w:tc>
           <w:tcPr>
-            <w:tcW w:type="dxa" w:w="1134"/>
+            <w:tcW w:type="dxa" w:w="1077"/>
             <w:vAlign w:val="top"/>
           </w:tcPr>
           <w:p>
@@ -532,7 +532,7 @@
         </w:tc>
         <w:tc>
           <w:tcPr>
-            <w:tcW w:type="dxa" w:w="1247"/>
+            <w:tcW w:type="dxa" w:w="1474"/>
             <w:vAlign w:val="top"/>
           </w:tcPr>
           <w:p>
@@ -544,15 +544,14 @@
               <w:rPr>
                 <w:b w:val="0"/>
                 <w:sz w:val="20"/>
-                <w:highlight w:val="yellow"/>
               </w:rPr>
-              <w:t>________</w:t>
+              <w:t>13,800</w:t>
             </w:r>
           </w:p>
         </w:tc>
         <w:tc>
           <w:tcPr>
-            <w:tcW w:type="dxa" w:w="1417"/>
+            <w:tcW w:type="dxa" w:w="1757"/>
             <w:vAlign w:val="top"/>
           </w:tcPr>
           <w:p>
@@ -564,9 +563,8 @@
               <w:rPr>
                 <w:b w:val="0"/>
                 <w:sz w:val="20"/>
-                <w:highlight w:val="yellow"/>
               </w:rPr>
-              <w:t>________</w:t>
+              <w:t>338,100,000</w:t>
             </w:r>
           </w:p>
         </w:tc>
@@ -595,7 +593,7 @@
         </w:tc>
         <w:tc>
           <w:tcPr>
-            <w:tcW w:type="dxa" w:w="3628"/>
+            <w:tcW w:type="dxa" w:w="3061"/>
             <w:vAlign w:val="top"/>
           </w:tcPr>
           <w:p>
@@ -613,7 +611,7 @@
         </w:tc>
         <w:tc>
           <w:tcPr>
-            <w:tcW w:type="dxa" w:w="1361"/>
+            <w:tcW w:type="dxa" w:w="1247"/>
             <w:vAlign w:val="top"/>
           </w:tcPr>
           <w:p>
@@ -649,7 +647,7 @@
         </w:tc>
         <w:tc>
           <w:tcPr>
-            <w:tcW w:type="dxa" w:w="1134"/>
+            <w:tcW w:type="dxa" w:w="1077"/>
             <w:vAlign w:val="top"/>
           </w:tcPr>
           <w:p>
@@ -668,7 +666,7 @@
         </w:tc>
         <w:tc>
           <w:tcPr>
-            <w:tcW w:type="dxa" w:w="1247"/>
+            <w:tcW w:type="dxa" w:w="1474"/>
             <w:vAlign w:val="top"/>
           </w:tcPr>
           <w:p>
@@ -680,15 +678,14 @@
               <w:rPr>
                 <w:b w:val="0"/>
                 <w:sz w:val="20"/>
-                <w:highlight w:val="yellow"/>
               </w:rPr>
-              <w:t>________</w:t>
+              <w:t>28,000</w:t>
             </w:r>
           </w:p>
         </w:tc>
         <w:tc>
           <w:tcPr>
-            <w:tcW w:type="dxa" w:w="1417"/>
+            <w:tcW w:type="dxa" w:w="1757"/>
             <w:vAlign w:val="top"/>
           </w:tcPr>
           <w:p>
@@ -700,9 +697,8 @@
               <w:rPr>
                 <w:b w:val="0"/>
                 <w:sz w:val="20"/>
-                <w:highlight w:val="yellow"/>
               </w:rPr>
-              <w:t>________</w:t>
+              <w:t>50,400,000</w:t>
             </w:r>
           </w:p>
         </w:tc>
@@ -731,7 +727,7 @@
         </w:tc>
         <w:tc>
           <w:tcPr>
-            <w:tcW w:type="dxa" w:w="3628"/>
+            <w:tcW w:type="dxa" w:w="3061"/>
             <w:vAlign w:val="top"/>
           </w:tcPr>
           <w:p>
@@ -749,7 +745,7 @@
         </w:tc>
         <w:tc>
           <w:tcPr>
-            <w:tcW w:type="dxa" w:w="1361"/>
+            <w:tcW w:type="dxa" w:w="1247"/>
             <w:vAlign w:val="top"/>
           </w:tcPr>
           <w:p>
@@ -785,7 +781,7 @@
         </w:tc>
         <w:tc>
           <w:tcPr>
-            <w:tcW w:type="dxa" w:w="1134"/>
+            <w:tcW w:type="dxa" w:w="1077"/>
             <w:vAlign w:val="top"/>
           </w:tcPr>
           <w:p>
@@ -804,7 +800,7 @@
         </w:tc>
         <w:tc>
           <w:tcPr>
-            <w:tcW w:type="dxa" w:w="1247"/>
+            <w:tcW w:type="dxa" w:w="1474"/>
             <w:vAlign w:val="top"/>
           </w:tcPr>
           <w:p>
@@ -816,15 +812,14 @@
               <w:rPr>
                 <w:b w:val="0"/>
                 <w:sz w:val="20"/>
-                <w:highlight w:val="yellow"/>
               </w:rPr>
-              <w:t>________</w:t>
+              <w:t>41,500</w:t>
             </w:r>
           </w:p>
         </w:tc>
         <w:tc>
           <w:tcPr>
-            <w:tcW w:type="dxa" w:w="1417"/>
+            <w:tcW w:type="dxa" w:w="1757"/>
             <w:vAlign w:val="top"/>
           </w:tcPr>
           <w:p>
@@ -836,9 +831,8 @@
               <w:rPr>
                 <w:b w:val="0"/>
                 <w:sz w:val="20"/>
-                <w:highlight w:val="yellow"/>
               </w:rPr>
-              <w:t>________</w:t>
+              <w:t>74,700,000</w:t>
             </w:r>
           </w:p>
         </w:tc>
@@ -867,7 +861,7 @@
         </w:tc>
         <w:tc>
           <w:tcPr>
-            <w:tcW w:type="dxa" w:w="3628"/>
+            <w:tcW w:type="dxa" w:w="3061"/>
             <w:vAlign w:val="top"/>
           </w:tcPr>
           <w:p>
@@ -885,7 +879,7 @@
         </w:tc>
         <w:tc>
           <w:tcPr>
-            <w:tcW w:type="dxa" w:w="1361"/>
+            <w:tcW w:type="dxa" w:w="1247"/>
             <w:vAlign w:val="top"/>
           </w:tcPr>
           <w:p>
@@ -921,7 +915,7 @@
         </w:tc>
         <w:tc>
           <w:tcPr>
-            <w:tcW w:type="dxa" w:w="1134"/>
+            <w:tcW w:type="dxa" w:w="1077"/>
             <w:vAlign w:val="top"/>
           </w:tcPr>
           <w:p>
@@ -940,7 +934,7 @@
         </w:tc>
         <w:tc>
           <w:tcPr>
-            <w:tcW w:type="dxa" w:w="1247"/>
+            <w:tcW w:type="dxa" w:w="1474"/>
             <w:vAlign w:val="top"/>
           </w:tcPr>
           <w:p>
@@ -952,15 +946,14 @@
               <w:rPr>
                 <w:b w:val="0"/>
                 <w:sz w:val="20"/>
-                <w:highlight w:val="yellow"/>
               </w:rPr>
-              <w:t>________</w:t>
+              <w:t>38,000</w:t>
             </w:r>
           </w:p>
         </w:tc>
         <w:tc>
           <w:tcPr>
-            <w:tcW w:type="dxa" w:w="1417"/>
+            <w:tcW w:type="dxa" w:w="1757"/>
             <w:vAlign w:val="top"/>
           </w:tcPr>
           <w:p>
@@ -972,9 +965,8 @@
               <w:rPr>
                 <w:b w:val="0"/>
                 <w:sz w:val="20"/>
-                <w:highlight w:val="yellow"/>
               </w:rPr>
-              <w:t>________</w:t>
+              <w:t>244,720,000</w:t>
             </w:r>
           </w:p>
         </w:tc>
@@ -985,7 +977,7 @@
         </w:trPr>
         <w:tc>
           <w:tcPr>
-            <w:tcW w:type="dxa" w:w="1417"/>
+            <w:tcW w:type="dxa" w:w="1757"/>
             <w:gridSpan w:val="7"/>
             <w:vAlign w:val="top"/>
             <w:shd w:val="clear" w:color="auto" w:fill="F2F2F2"/>
@@ -1028,7 +1020,7 @@
         </w:tc>
         <w:tc>
           <w:tcPr>
-            <w:tcW w:type="dxa" w:w="3628"/>
+            <w:tcW w:type="dxa" w:w="3061"/>
             <w:vAlign w:val="top"/>
           </w:tcPr>
           <w:p>
@@ -1046,7 +1038,7 @@
         </w:tc>
         <w:tc>
           <w:tcPr>
-            <w:tcW w:type="dxa" w:w="1361"/>
+            <w:tcW w:type="dxa" w:w="1247"/>
             <w:vAlign w:val="top"/>
           </w:tcPr>
           <w:p>
@@ -1082,7 +1074,7 @@
         </w:tc>
         <w:tc>
           <w:tcPr>
-            <w:tcW w:type="dxa" w:w="1134"/>
+            <w:tcW w:type="dxa" w:w="1077"/>
             <w:vAlign w:val="top"/>
           </w:tcPr>
           <w:p>
@@ -1101,7 +1093,7 @@
         </w:tc>
         <w:tc>
           <w:tcPr>
-            <w:tcW w:type="dxa" w:w="1247"/>
+            <w:tcW w:type="dxa" w:w="1474"/>
             <w:vAlign w:val="top"/>
           </w:tcPr>
           <w:p>
@@ -1113,15 +1105,14 @@
               <w:rPr>
                 <w:b w:val="0"/>
                 <w:sz w:val="20"/>
-                <w:highlight w:val="yellow"/>
               </w:rPr>
-              <w:t>________</w:t>
+              <w:t>40,000</w:t>
             </w:r>
           </w:p>
         </w:tc>
         <w:tc>
           <w:tcPr>
-            <w:tcW w:type="dxa" w:w="1417"/>
+            <w:tcW w:type="dxa" w:w="1757"/>
             <w:vAlign w:val="top"/>
           </w:tcPr>
           <w:p>
@@ -1133,9 +1124,8 @@
               <w:rPr>
                 <w:b w:val="0"/>
                 <w:sz w:val="20"/>
-                <w:highlight w:val="yellow"/>
               </w:rPr>
-              <w:t>________</w:t>
+              <w:t>920,000,000</w:t>
             </w:r>
           </w:p>
         </w:tc>
@@ -1164,7 +1154,7 @@
         </w:tc>
         <w:tc>
           <w:tcPr>
-            <w:tcW w:type="dxa" w:w="3628"/>
+            <w:tcW w:type="dxa" w:w="3061"/>
             <w:vAlign w:val="top"/>
           </w:tcPr>
           <w:p>
@@ -1182,7 +1172,7 @@
         </w:tc>
         <w:tc>
           <w:tcPr>
-            <w:tcW w:type="dxa" w:w="1361"/>
+            <w:tcW w:type="dxa" w:w="1247"/>
             <w:vAlign w:val="top"/>
           </w:tcPr>
           <w:p>
@@ -1218,7 +1208,7 @@
         </w:tc>
         <w:tc>
           <w:tcPr>
-            <w:tcW w:type="dxa" w:w="1134"/>
+            <w:tcW w:type="dxa" w:w="1077"/>
             <w:vAlign w:val="top"/>
           </w:tcPr>
           <w:p>
@@ -1237,7 +1227,7 @@
         </w:tc>
         <w:tc>
           <w:tcPr>
-            <w:tcW w:type="dxa" w:w="1247"/>
+            <w:tcW w:type="dxa" w:w="1474"/>
             <w:vAlign w:val="top"/>
           </w:tcPr>
           <w:p>
@@ -1249,15 +1239,14 @@
               <w:rPr>
                 <w:b w:val="0"/>
                 <w:sz w:val="20"/>
-                <w:highlight w:val="yellow"/>
               </w:rPr>
-              <w:t>________</w:t>
+              <w:t>38,000</w:t>
             </w:r>
           </w:p>
         </w:tc>
         <w:tc>
           <w:tcPr>
-            <w:tcW w:type="dxa" w:w="1417"/>
+            <w:tcW w:type="dxa" w:w="1757"/>
             <w:vAlign w:val="top"/>
           </w:tcPr>
           <w:p>
@@ -1269,9 +1258,8 @@
               <w:rPr>
                 <w:b w:val="0"/>
                 <w:sz w:val="20"/>
-                <w:highlight w:val="yellow"/>
               </w:rPr>
-              <w:t>________</w:t>
+              <w:t>931,000,000</w:t>
             </w:r>
           </w:p>
         </w:tc>
@@ -1299,7 +1287,7 @@
         </w:tc>
         <w:tc>
           <w:tcPr>
-            <w:tcW w:type="dxa" w:w="1417"/>
+            <w:tcW w:type="dxa" w:w="1757"/>
             <w:gridSpan w:val="6"/>
             <w:vAlign w:val="top"/>
           </w:tcPr>
@@ -1341,7 +1329,7 @@
         </w:tc>
         <w:tc>
           <w:tcPr>
-            <w:tcW w:type="dxa" w:w="3628"/>
+            <w:tcW w:type="dxa" w:w="3061"/>
             <w:vAlign w:val="top"/>
           </w:tcPr>
           <w:p>
@@ -1359,7 +1347,7 @@
         </w:tc>
         <w:tc>
           <w:tcPr>
-            <w:tcW w:type="dxa" w:w="1361"/>
+            <w:tcW w:type="dxa" w:w="1247"/>
             <w:vAlign w:val="top"/>
           </w:tcPr>
           <w:p>
@@ -1395,7 +1383,7 @@
         </w:tc>
         <w:tc>
           <w:tcPr>
-            <w:tcW w:type="dxa" w:w="1134"/>
+            <w:tcW w:type="dxa" w:w="1077"/>
             <w:vAlign w:val="top"/>
           </w:tcPr>
           <w:p>
@@ -1414,7 +1402,7 @@
         </w:tc>
         <w:tc>
           <w:tcPr>
-            <w:tcW w:type="dxa" w:w="1247"/>
+            <w:tcW w:type="dxa" w:w="1474"/>
             <w:vAlign w:val="top"/>
           </w:tcPr>
           <w:p>
@@ -1426,15 +1414,14 @@
               <w:rPr>
                 <w:b w:val="0"/>
                 <w:sz w:val="20"/>
-                <w:highlight w:val="yellow"/>
               </w:rPr>
-              <w:t>________</w:t>
+              <w:t>37,500</w:t>
             </w:r>
           </w:p>
         </w:tc>
         <w:tc>
           <w:tcPr>
-            <w:tcW w:type="dxa" w:w="1417"/>
+            <w:tcW w:type="dxa" w:w="1757"/>
             <w:vAlign w:val="top"/>
           </w:tcPr>
           <w:p>
@@ -1446,9 +1433,8 @@
               <w:rPr>
                 <w:b w:val="0"/>
                 <w:sz w:val="20"/>
-                <w:highlight w:val="yellow"/>
               </w:rPr>
-              <w:t>________</w:t>
+              <w:t>131,250,000</w:t>
             </w:r>
           </w:p>
         </w:tc>
@@ -1477,7 +1463,7 @@
         </w:tc>
         <w:tc>
           <w:tcPr>
-            <w:tcW w:type="dxa" w:w="3628"/>
+            <w:tcW w:type="dxa" w:w="3061"/>
             <w:vAlign w:val="top"/>
           </w:tcPr>
           <w:p>
@@ -1495,7 +1481,7 @@
         </w:tc>
         <w:tc>
           <w:tcPr>
-            <w:tcW w:type="dxa" w:w="1361"/>
+            <w:tcW w:type="dxa" w:w="1247"/>
             <w:vAlign w:val="top"/>
           </w:tcPr>
           <w:p>
@@ -1531,7 +1517,7 @@
         </w:tc>
         <w:tc>
           <w:tcPr>
-            <w:tcW w:type="dxa" w:w="1134"/>
+            <w:tcW w:type="dxa" w:w="1077"/>
             <w:vAlign w:val="top"/>
           </w:tcPr>
           <w:p>
@@ -1550,7 +1536,7 @@
         </w:tc>
         <w:tc>
           <w:tcPr>
-            <w:tcW w:type="dxa" w:w="1247"/>
+            <w:tcW w:type="dxa" w:w="1474"/>
             <w:vAlign w:val="top"/>
           </w:tcPr>
           <w:p>
@@ -1562,15 +1548,14 @@
               <w:rPr>
                 <w:b w:val="0"/>
                 <w:sz w:val="20"/>
-                <w:highlight w:val="yellow"/>
               </w:rPr>
-              <w:t>________</w:t>
+              <w:t>35,000</w:t>
             </w:r>
           </w:p>
         </w:tc>
         <w:tc>
           <w:tcPr>
-            <w:tcW w:type="dxa" w:w="1417"/>
+            <w:tcW w:type="dxa" w:w="1757"/>
             <w:vAlign w:val="top"/>
           </w:tcPr>
           <w:p>
@@ -1582,9 +1567,8 @@
               <w:rPr>
                 <w:b w:val="0"/>
                 <w:sz w:val="20"/>
-                <w:highlight w:val="yellow"/>
               </w:rPr>
-              <w:t>________</w:t>
+              <w:t>245,000,000</w:t>
             </w:r>
           </w:p>
         </w:tc>
@@ -1613,7 +1597,7 @@
         </w:tc>
         <w:tc>
           <w:tcPr>
-            <w:tcW w:type="dxa" w:w="3628"/>
+            <w:tcW w:type="dxa" w:w="3061"/>
             <w:vAlign w:val="top"/>
           </w:tcPr>
           <w:p>
@@ -1631,7 +1615,7 @@
         </w:tc>
         <w:tc>
           <w:tcPr>
-            <w:tcW w:type="dxa" w:w="1361"/>
+            <w:tcW w:type="dxa" w:w="1247"/>
             <w:vAlign w:val="top"/>
           </w:tcPr>
           <w:p>
@@ -1667,7 +1651,7 @@
         </w:tc>
         <w:tc>
           <w:tcPr>
-            <w:tcW w:type="dxa" w:w="1134"/>
+            <w:tcW w:type="dxa" w:w="1077"/>
             <w:vAlign w:val="top"/>
           </w:tcPr>
           <w:p>
@@ -1686,7 +1670,7 @@
         </w:tc>
         <w:tc>
           <w:tcPr>
-            <w:tcW w:type="dxa" w:w="1247"/>
+            <w:tcW w:type="dxa" w:w="1474"/>
             <w:vAlign w:val="top"/>
           </w:tcPr>
           <w:p>
@@ -1698,15 +1682,14 @@
               <w:rPr>
                 <w:b w:val="0"/>
                 <w:sz w:val="20"/>
-                <w:highlight w:val="yellow"/>
               </w:rPr>
-              <w:t>________</w:t>
+              <w:t>42,000</w:t>
             </w:r>
           </w:p>
         </w:tc>
         <w:tc>
           <w:tcPr>
-            <w:tcW w:type="dxa" w:w="1417"/>
+            <w:tcW w:type="dxa" w:w="1757"/>
             <w:vAlign w:val="top"/>
           </w:tcPr>
           <w:p>
@@ -1718,9 +1701,8 @@
               <w:rPr>
                 <w:b w:val="0"/>
                 <w:sz w:val="20"/>
-                <w:highlight w:val="yellow"/>
               </w:rPr>
-              <w:t>________</w:t>
+              <w:t>441,000,000</w:t>
             </w:r>
           </w:p>
         </w:tc>
@@ -1748,7 +1730,7 @@
         </w:tc>
         <w:tc>
           <w:tcPr>
-            <w:tcW w:type="dxa" w:w="1417"/>
+            <w:tcW w:type="dxa" w:w="1757"/>
             <w:gridSpan w:val="6"/>
             <w:vAlign w:val="top"/>
           </w:tcPr>
@@ -1790,7 +1772,7 @@
         </w:tc>
         <w:tc>
           <w:tcPr>
-            <w:tcW w:type="dxa" w:w="3628"/>
+            <w:tcW w:type="dxa" w:w="3061"/>
             <w:vAlign w:val="top"/>
           </w:tcPr>
           <w:p>
@@ -1808,7 +1790,7 @@
         </w:tc>
         <w:tc>
           <w:tcPr>
-            <w:tcW w:type="dxa" w:w="1361"/>
+            <w:tcW w:type="dxa" w:w="1247"/>
             <w:vAlign w:val="top"/>
           </w:tcPr>
           <w:p>
@@ -1844,7 +1826,7 @@
         </w:tc>
         <w:tc>
           <w:tcPr>
-            <w:tcW w:type="dxa" w:w="1134"/>
+            <w:tcW w:type="dxa" w:w="1077"/>
             <w:vAlign w:val="top"/>
           </w:tcPr>
           <w:p>
@@ -1863,7 +1845,7 @@
         </w:tc>
         <w:tc>
           <w:tcPr>
-            <w:tcW w:type="dxa" w:w="1247"/>
+            <w:tcW w:type="dxa" w:w="1474"/>
             <w:vAlign w:val="top"/>
           </w:tcPr>
           <w:p>
@@ -1875,15 +1857,14 @@
               <w:rPr>
                 <w:b w:val="0"/>
                 <w:sz w:val="20"/>
-                <w:highlight w:val="yellow"/>
               </w:rPr>
-              <w:t>________</w:t>
+              <w:t>300,000</w:t>
             </w:r>
           </w:p>
         </w:tc>
         <w:tc>
           <w:tcPr>
-            <w:tcW w:type="dxa" w:w="1417"/>
+            <w:tcW w:type="dxa" w:w="1757"/>
             <w:vAlign w:val="top"/>
           </w:tcPr>
           <w:p>
@@ -1895,9 +1876,8 @@
               <w:rPr>
                 <w:b w:val="0"/>
                 <w:sz w:val="20"/>
-                <w:highlight w:val="yellow"/>
               </w:rPr>
-              <w:t>________</w:t>
+              <w:t>1,800,000</w:t>
             </w:r>
           </w:p>
         </w:tc>
@@ -1926,7 +1906,7 @@
         </w:tc>
         <w:tc>
           <w:tcPr>
-            <w:tcW w:type="dxa" w:w="3628"/>
+            <w:tcW w:type="dxa" w:w="3061"/>
             <w:vAlign w:val="top"/>
           </w:tcPr>
           <w:p>
@@ -1944,7 +1924,7 @@
         </w:tc>
         <w:tc>
           <w:tcPr>
-            <w:tcW w:type="dxa" w:w="1361"/>
+            <w:tcW w:type="dxa" w:w="1247"/>
             <w:vAlign w:val="top"/>
           </w:tcPr>
           <w:p>
@@ -1980,7 +1960,7 @@
         </w:tc>
         <w:tc>
           <w:tcPr>
-            <w:tcW w:type="dxa" w:w="1134"/>
+            <w:tcW w:type="dxa" w:w="1077"/>
             <w:vAlign w:val="top"/>
           </w:tcPr>
           <w:p>
@@ -1999,7 +1979,7 @@
         </w:tc>
         <w:tc>
           <w:tcPr>
-            <w:tcW w:type="dxa" w:w="1247"/>
+            <w:tcW w:type="dxa" w:w="1474"/>
             <w:vAlign w:val="top"/>
           </w:tcPr>
           <w:p>
@@ -2011,15 +1991,14 @@
               <w:rPr>
                 <w:b w:val="0"/>
                 <w:sz w:val="20"/>
-                <w:highlight w:val="yellow"/>
               </w:rPr>
-              <w:t>________</w:t>
+              <w:t>300,000</w:t>
             </w:r>
           </w:p>
         </w:tc>
         <w:tc>
           <w:tcPr>
-            <w:tcW w:type="dxa" w:w="1417"/>
+            <w:tcW w:type="dxa" w:w="1757"/>
             <w:vAlign w:val="top"/>
           </w:tcPr>
           <w:p>
@@ -2031,9 +2010,8 @@
               <w:rPr>
                 <w:b w:val="0"/>
                 <w:sz w:val="20"/>
-                <w:highlight w:val="yellow"/>
               </w:rPr>
-              <w:t>________</w:t>
+              <w:t>1,800,000</w:t>
             </w:r>
           </w:p>
         </w:tc>
@@ -2062,7 +2040,7 @@
         </w:tc>
         <w:tc>
           <w:tcPr>
-            <w:tcW w:type="dxa" w:w="3628"/>
+            <w:tcW w:type="dxa" w:w="3061"/>
             <w:vAlign w:val="top"/>
           </w:tcPr>
           <w:p>
@@ -2080,7 +2058,7 @@
         </w:tc>
         <w:tc>
           <w:tcPr>
-            <w:tcW w:type="dxa" w:w="1361"/>
+            <w:tcW w:type="dxa" w:w="1247"/>
             <w:vAlign w:val="top"/>
           </w:tcPr>
           <w:p>
@@ -2116,7 +2094,7 @@
         </w:tc>
         <w:tc>
           <w:tcPr>
-            <w:tcW w:type="dxa" w:w="1134"/>
+            <w:tcW w:type="dxa" w:w="1077"/>
             <w:vAlign w:val="top"/>
           </w:tcPr>
           <w:p>
@@ -2135,7 +2113,7 @@
         </w:tc>
         <w:tc>
           <w:tcPr>
-            <w:tcW w:type="dxa" w:w="1247"/>
+            <w:tcW w:type="dxa" w:w="1474"/>
             <w:vAlign w:val="top"/>
           </w:tcPr>
           <w:p>
@@ -2147,15 +2125,14 @@
               <w:rPr>
                 <w:b w:val="0"/>
                 <w:sz w:val="20"/>
-                <w:highlight w:val="yellow"/>
               </w:rPr>
-              <w:t>________</w:t>
+              <w:t>300,000</w:t>
             </w:r>
           </w:p>
         </w:tc>
         <w:tc>
           <w:tcPr>
-            <w:tcW w:type="dxa" w:w="1417"/>
+            <w:tcW w:type="dxa" w:w="1757"/>
             <w:vAlign w:val="top"/>
           </w:tcPr>
           <w:p>
@@ -2167,9 +2144,8 @@
               <w:rPr>
                 <w:b w:val="0"/>
                 <w:sz w:val="20"/>
-                <w:highlight w:val="yellow"/>
               </w:rPr>
-              <w:t>________</w:t>
+              <w:t>1,800,000</w:t>
             </w:r>
           </w:p>
         </w:tc>
@@ -2198,7 +2174,7 @@
         </w:tc>
         <w:tc>
           <w:tcPr>
-            <w:tcW w:type="dxa" w:w="3628"/>
+            <w:tcW w:type="dxa" w:w="3061"/>
             <w:vAlign w:val="top"/>
           </w:tcPr>
           <w:p>
@@ -2216,7 +2192,7 @@
         </w:tc>
         <w:tc>
           <w:tcPr>
-            <w:tcW w:type="dxa" w:w="1361"/>
+            <w:tcW w:type="dxa" w:w="1247"/>
             <w:vAlign w:val="top"/>
           </w:tcPr>
           <w:p>
@@ -2252,7 +2228,7 @@
         </w:tc>
         <w:tc>
           <w:tcPr>
-            <w:tcW w:type="dxa" w:w="1134"/>
+            <w:tcW w:type="dxa" w:w="1077"/>
             <w:vAlign w:val="top"/>
           </w:tcPr>
           <w:p>
@@ -2271,7 +2247,7 @@
         </w:tc>
         <w:tc>
           <w:tcPr>
-            <w:tcW w:type="dxa" w:w="1247"/>
+            <w:tcW w:type="dxa" w:w="1474"/>
             <w:vAlign w:val="top"/>
           </w:tcPr>
           <w:p>
@@ -2283,15 +2259,14 @@
               <w:rPr>
                 <w:b w:val="0"/>
                 <w:sz w:val="20"/>
-                <w:highlight w:val="yellow"/>
               </w:rPr>
-              <w:t>________</w:t>
+              <w:t>300,000</w:t>
             </w:r>
           </w:p>
         </w:tc>
         <w:tc>
           <w:tcPr>
-            <w:tcW w:type="dxa" w:w="1417"/>
+            <w:tcW w:type="dxa" w:w="1757"/>
             <w:vAlign w:val="top"/>
           </w:tcPr>
           <w:p>
@@ -2303,9 +2278,8 @@
               <w:rPr>
                 <w:b w:val="0"/>
                 <w:sz w:val="20"/>
-                <w:highlight w:val="yellow"/>
               </w:rPr>
-              <w:t>________</w:t>
+              <w:t>1,800,000</w:t>
             </w:r>
           </w:p>
         </w:tc>
@@ -2316,7 +2290,7 @@
         </w:trPr>
         <w:tc>
           <w:tcPr>
-            <w:tcW w:type="dxa" w:w="1417"/>
+            <w:tcW w:type="dxa" w:w="1757"/>
             <w:gridSpan w:val="7"/>
             <w:vAlign w:val="top"/>
             <w:shd w:val="clear" w:color="auto" w:fill="F2F2F2"/>
@@ -2359,7 +2333,7 @@
         </w:tc>
         <w:tc>
           <w:tcPr>
-            <w:tcW w:type="dxa" w:w="3628"/>
+            <w:tcW w:type="dxa" w:w="3061"/>
             <w:vAlign w:val="top"/>
           </w:tcPr>
           <w:p>
@@ -2377,7 +2351,7 @@
         </w:tc>
         <w:tc>
           <w:tcPr>
-            <w:tcW w:type="dxa" w:w="1361"/>
+            <w:tcW w:type="dxa" w:w="1247"/>
             <w:vAlign w:val="top"/>
           </w:tcPr>
           <w:p>
@@ -2413,7 +2387,7 @@
         </w:tc>
         <w:tc>
           <w:tcPr>
-            <w:tcW w:type="dxa" w:w="1134"/>
+            <w:tcW w:type="dxa" w:w="1077"/>
             <w:vAlign w:val="top"/>
           </w:tcPr>
           <w:p>
@@ -2432,7 +2406,7 @@
         </w:tc>
         <w:tc>
           <w:tcPr>
-            <w:tcW w:type="dxa" w:w="1247"/>
+            <w:tcW w:type="dxa" w:w="1474"/>
             <w:vAlign w:val="top"/>
           </w:tcPr>
           <w:p>
@@ -2444,15 +2418,14 @@
               <w:rPr>
                 <w:b w:val="0"/>
                 <w:sz w:val="20"/>
-                <w:highlight w:val="yellow"/>
               </w:rPr>
-              <w:t>________</w:t>
+              <w:t>38,000</w:t>
             </w:r>
           </w:p>
         </w:tc>
         <w:tc>
           <w:tcPr>
-            <w:tcW w:type="dxa" w:w="1417"/>
+            <w:tcW w:type="dxa" w:w="1757"/>
             <w:vAlign w:val="top"/>
           </w:tcPr>
           <w:p>
@@ -2464,9 +2437,8 @@
               <w:rPr>
                 <w:b w:val="0"/>
                 <w:sz w:val="20"/>
-                <w:highlight w:val="yellow"/>
               </w:rPr>
-              <w:t>________</w:t>
+              <w:t>530,480,000</w:t>
             </w:r>
           </w:p>
         </w:tc>
@@ -2495,7 +2467,7 @@
         </w:tc>
         <w:tc>
           <w:tcPr>
-            <w:tcW w:type="dxa" w:w="3628"/>
+            <w:tcW w:type="dxa" w:w="3061"/>
             <w:vAlign w:val="top"/>
           </w:tcPr>
           <w:p>
@@ -2513,7 +2485,7 @@
         </w:tc>
         <w:tc>
           <w:tcPr>
-            <w:tcW w:type="dxa" w:w="1361"/>
+            <w:tcW w:type="dxa" w:w="1247"/>
             <w:vAlign w:val="top"/>
           </w:tcPr>
           <w:p>
@@ -2549,7 +2521,7 @@
         </w:tc>
         <w:tc>
           <w:tcPr>
-            <w:tcW w:type="dxa" w:w="1134"/>
+            <w:tcW w:type="dxa" w:w="1077"/>
             <w:vAlign w:val="top"/>
           </w:tcPr>
           <w:p>
@@ -2568,7 +2540,7 @@
         </w:tc>
         <w:tc>
           <w:tcPr>
-            <w:tcW w:type="dxa" w:w="1247"/>
+            <w:tcW w:type="dxa" w:w="1474"/>
             <w:vAlign w:val="top"/>
           </w:tcPr>
           <w:p>
@@ -2580,15 +2552,14 @@
               <w:rPr>
                 <w:b w:val="0"/>
                 <w:sz w:val="20"/>
-                <w:highlight w:val="yellow"/>
               </w:rPr>
-              <w:t>________</w:t>
+              <w:t>60,000</w:t>
             </w:r>
           </w:p>
         </w:tc>
         <w:tc>
           <w:tcPr>
-            <w:tcW w:type="dxa" w:w="1417"/>
+            <w:tcW w:type="dxa" w:w="1757"/>
             <w:vAlign w:val="top"/>
           </w:tcPr>
           <w:p>
@@ -2600,9 +2571,8 @@
               <w:rPr>
                 <w:b w:val="0"/>
                 <w:sz w:val="20"/>
-                <w:highlight w:val="yellow"/>
               </w:rPr>
-              <w:t>________</w:t>
+              <w:t>51,600,000</w:t>
             </w:r>
           </w:p>
         </w:tc>
@@ -2630,7 +2600,7 @@
         </w:tc>
         <w:tc>
           <w:tcPr>
-            <w:tcW w:type="dxa" w:w="1417"/>
+            <w:tcW w:type="dxa" w:w="1757"/>
             <w:gridSpan w:val="6"/>
             <w:vAlign w:val="top"/>
           </w:tcPr>
@@ -2672,7 +2642,7 @@
         </w:tc>
         <w:tc>
           <w:tcPr>
-            <w:tcW w:type="dxa" w:w="3628"/>
+            <w:tcW w:type="dxa" w:w="3061"/>
             <w:vAlign w:val="top"/>
           </w:tcPr>
           <w:p>
@@ -2690,7 +2660,7 @@
         </w:tc>
         <w:tc>
           <w:tcPr>
-            <w:tcW w:type="dxa" w:w="1361"/>
+            <w:tcW w:type="dxa" w:w="1247"/>
             <w:vAlign w:val="top"/>
           </w:tcPr>
           <w:p>
@@ -2726,7 +2696,7 @@
         </w:tc>
         <w:tc>
           <w:tcPr>
-            <w:tcW w:type="dxa" w:w="1134"/>
+            <w:tcW w:type="dxa" w:w="1077"/>
             <w:vAlign w:val="top"/>
           </w:tcPr>
           <w:p>
@@ -2745,7 +2715,7 @@
         </w:tc>
         <w:tc>
           <w:tcPr>
-            <w:tcW w:type="dxa" w:w="1247"/>
+            <w:tcW w:type="dxa" w:w="1474"/>
             <w:vAlign w:val="top"/>
           </w:tcPr>
           <w:p>
@@ -2757,15 +2727,14 @@
               <w:rPr>
                 <w:b w:val="0"/>
                 <w:sz w:val="20"/>
-                <w:highlight w:val="yellow"/>
               </w:rPr>
-              <w:t>________</w:t>
+              <w:t>32,000</w:t>
             </w:r>
           </w:p>
         </w:tc>
         <w:tc>
           <w:tcPr>
-            <w:tcW w:type="dxa" w:w="1417"/>
+            <w:tcW w:type="dxa" w:w="1757"/>
             <w:vAlign w:val="top"/>
           </w:tcPr>
           <w:p>
@@ -2777,9 +2746,8 @@
               <w:rPr>
                 <w:b w:val="0"/>
                 <w:sz w:val="20"/>
-                <w:highlight w:val="yellow"/>
               </w:rPr>
-              <w:t>________</w:t>
+              <w:t>743,040,000</w:t>
             </w:r>
           </w:p>
         </w:tc>
@@ -2808,7 +2776,7 @@
         </w:tc>
         <w:tc>
           <w:tcPr>
-            <w:tcW w:type="dxa" w:w="3628"/>
+            <w:tcW w:type="dxa" w:w="3061"/>
             <w:vAlign w:val="top"/>
           </w:tcPr>
           <w:p>
@@ -2826,7 +2794,7 @@
         </w:tc>
         <w:tc>
           <w:tcPr>
-            <w:tcW w:type="dxa" w:w="1361"/>
+            <w:tcW w:type="dxa" w:w="1247"/>
             <w:vAlign w:val="top"/>
           </w:tcPr>
           <w:p>
@@ -2862,7 +2830,7 @@
         </w:tc>
         <w:tc>
           <w:tcPr>
-            <w:tcW w:type="dxa" w:w="1134"/>
+            <w:tcW w:type="dxa" w:w="1077"/>
             <w:vAlign w:val="top"/>
           </w:tcPr>
           <w:p>
@@ -2881,7 +2849,7 @@
         </w:tc>
         <w:tc>
           <w:tcPr>
-            <w:tcW w:type="dxa" w:w="1247"/>
+            <w:tcW w:type="dxa" w:w="1474"/>
             <w:vAlign w:val="top"/>
           </w:tcPr>
           <w:p>
@@ -2893,15 +2861,14 @@
               <w:rPr>
                 <w:b w:val="0"/>
                 <w:sz w:val="20"/>
-                <w:highlight w:val="yellow"/>
               </w:rPr>
-              <w:t>________</w:t>
+              <w:t>32,000</w:t>
             </w:r>
           </w:p>
         </w:tc>
         <w:tc>
           <w:tcPr>
-            <w:tcW w:type="dxa" w:w="1417"/>
+            <w:tcW w:type="dxa" w:w="1757"/>
             <w:vAlign w:val="top"/>
           </w:tcPr>
           <w:p>
@@ -2913,9 +2880,8 @@
               <w:rPr>
                 <w:b w:val="0"/>
                 <w:sz w:val="20"/>
-                <w:highlight w:val="yellow"/>
               </w:rPr>
-              <w:t>________</w:t>
+              <w:t>117,760,000</w:t>
             </w:r>
           </w:p>
         </w:tc>
@@ -2926,7 +2892,7 @@
         </w:trPr>
         <w:tc>
           <w:tcPr>
-            <w:tcW w:type="dxa" w:w="1417"/>
+            <w:tcW w:type="dxa" w:w="1757"/>
             <w:gridSpan w:val="7"/>
             <w:vAlign w:val="top"/>
             <w:shd w:val="clear" w:color="auto" w:fill="F2F2F2"/>
@@ -2969,7 +2935,7 @@
         </w:tc>
         <w:tc>
           <w:tcPr>
-            <w:tcW w:type="dxa" w:w="3628"/>
+            <w:tcW w:type="dxa" w:w="3061"/>
             <w:vAlign w:val="top"/>
           </w:tcPr>
           <w:p>
@@ -2987,7 +2953,7 @@
         </w:tc>
         <w:tc>
           <w:tcPr>
-            <w:tcW w:type="dxa" w:w="1361"/>
+            <w:tcW w:type="dxa" w:w="1247"/>
             <w:vAlign w:val="top"/>
           </w:tcPr>
           <w:p>
@@ -3023,7 +2989,7 @@
         </w:tc>
         <w:tc>
           <w:tcPr>
-            <w:tcW w:type="dxa" w:w="1134"/>
+            <w:tcW w:type="dxa" w:w="1077"/>
             <w:vAlign w:val="top"/>
           </w:tcPr>
           <w:p>
@@ -3042,7 +3008,7 @@
         </w:tc>
         <w:tc>
           <w:tcPr>
-            <w:tcW w:type="dxa" w:w="1247"/>
+            <w:tcW w:type="dxa" w:w="1474"/>
             <w:vAlign w:val="top"/>
           </w:tcPr>
           <w:p>
@@ -3054,15 +3020,14 @@
               <w:rPr>
                 <w:b w:val="0"/>
                 <w:sz w:val="20"/>
-                <w:highlight w:val="yellow"/>
               </w:rPr>
-              <w:t>________</w:t>
+              <w:t>от 50,000,000</w:t>
             </w:r>
           </w:p>
         </w:tc>
         <w:tc>
           <w:tcPr>
-            <w:tcW w:type="dxa" w:w="1417"/>
+            <w:tcW w:type="dxa" w:w="1757"/>
             <w:vAlign w:val="top"/>
           </w:tcPr>
           <w:p>
@@ -3074,9 +3039,8 @@
               <w:rPr>
                 <w:b w:val="0"/>
                 <w:sz w:val="20"/>
-                <w:highlight w:val="yellow"/>
               </w:rPr>
-              <w:t>________</w:t>
+              <w:t>от 50,000,000</w:t>
             </w:r>
           </w:p>
         </w:tc>
@@ -3105,7 +3069,7 @@
         </w:tc>
         <w:tc>
           <w:tcPr>
-            <w:tcW w:type="dxa" w:w="3628"/>
+            <w:tcW w:type="dxa" w:w="3061"/>
             <w:vAlign w:val="top"/>
           </w:tcPr>
           <w:p>
@@ -3123,7 +3087,7 @@
         </w:tc>
         <w:tc>
           <w:tcPr>
-            <w:tcW w:type="dxa" w:w="1361"/>
+            <w:tcW w:type="dxa" w:w="1247"/>
             <w:vAlign w:val="top"/>
           </w:tcPr>
           <w:p>
@@ -3159,7 +3123,7 @@
         </w:tc>
         <w:tc>
           <w:tcPr>
-            <w:tcW w:type="dxa" w:w="1134"/>
+            <w:tcW w:type="dxa" w:w="1077"/>
             <w:vAlign w:val="top"/>
           </w:tcPr>
           <w:p>
@@ -3178,7 +3142,7 @@
         </w:tc>
         <w:tc>
           <w:tcPr>
-            <w:tcW w:type="dxa" w:w="1247"/>
+            <w:tcW w:type="dxa" w:w="1474"/>
             <w:vAlign w:val="top"/>
           </w:tcPr>
           <w:p>
@@ -3190,15 +3154,14 @@
               <w:rPr>
                 <w:b w:val="0"/>
                 <w:sz w:val="20"/>
-                <w:highlight w:val="yellow"/>
               </w:rPr>
-              <w:t>________</w:t>
+              <w:t>3,200,000</w:t>
             </w:r>
           </w:p>
         </w:tc>
         <w:tc>
           <w:tcPr>
-            <w:tcW w:type="dxa" w:w="1417"/>
+            <w:tcW w:type="dxa" w:w="1757"/>
             <w:vAlign w:val="top"/>
           </w:tcPr>
           <w:p>
@@ -3210,9 +3173,8 @@
               <w:rPr>
                 <w:b w:val="0"/>
                 <w:sz w:val="20"/>
-                <w:highlight w:val="yellow"/>
               </w:rPr>
-              <w:t>________</w:t>
+              <w:t>12,800,000</w:t>
             </w:r>
           </w:p>
         </w:tc>
@@ -3241,7 +3203,7 @@
         </w:tc>
         <w:tc>
           <w:tcPr>
-            <w:tcW w:type="dxa" w:w="3628"/>
+            <w:tcW w:type="dxa" w:w="3061"/>
             <w:vAlign w:val="top"/>
           </w:tcPr>
           <w:p>
@@ -3259,7 +3221,7 @@
         </w:tc>
         <w:tc>
           <w:tcPr>
-            <w:tcW w:type="dxa" w:w="1361"/>
+            <w:tcW w:type="dxa" w:w="1247"/>
             <w:vAlign w:val="top"/>
           </w:tcPr>
           <w:p>
@@ -3295,7 +3257,7 @@
         </w:tc>
         <w:tc>
           <w:tcPr>
-            <w:tcW w:type="dxa" w:w="1134"/>
+            <w:tcW w:type="dxa" w:w="1077"/>
             <w:vAlign w:val="top"/>
           </w:tcPr>
           <w:p>
@@ -3314,7 +3276,7 @@
         </w:tc>
         <w:tc>
           <w:tcPr>
-            <w:tcW w:type="dxa" w:w="1247"/>
+            <w:tcW w:type="dxa" w:w="1474"/>
             <w:vAlign w:val="top"/>
           </w:tcPr>
           <w:p>
@@ -3326,15 +3288,14 @@
               <w:rPr>
                 <w:b w:val="0"/>
                 <w:sz w:val="20"/>
-                <w:highlight w:val="yellow"/>
               </w:rPr>
-              <w:t>________</w:t>
+              <w:t>от 60,000,000</w:t>
             </w:r>
           </w:p>
         </w:tc>
         <w:tc>
           <w:tcPr>
-            <w:tcW w:type="dxa" w:w="1417"/>
+            <w:tcW w:type="dxa" w:w="1757"/>
             <w:vAlign w:val="top"/>
           </w:tcPr>
           <w:p>
@@ -3346,9 +3307,8 @@
               <w:rPr>
                 <w:b w:val="0"/>
                 <w:sz w:val="20"/>
-                <w:highlight w:val="yellow"/>
               </w:rPr>
-              <w:t>________</w:t>
+              <w:t>от 60,000,000</w:t>
             </w:r>
           </w:p>
         </w:tc>
@@ -3377,7 +3337,7 @@
         </w:tc>
         <w:tc>
           <w:tcPr>
-            <w:tcW w:type="dxa" w:w="3628"/>
+            <w:tcW w:type="dxa" w:w="3061"/>
             <w:vAlign w:val="top"/>
           </w:tcPr>
           <w:p>
@@ -3395,7 +3355,7 @@
         </w:tc>
         <w:tc>
           <w:tcPr>
-            <w:tcW w:type="dxa" w:w="1361"/>
+            <w:tcW w:type="dxa" w:w="1247"/>
             <w:vAlign w:val="top"/>
           </w:tcPr>
           <w:p>
@@ -3431,7 +3391,7 @@
         </w:tc>
         <w:tc>
           <w:tcPr>
-            <w:tcW w:type="dxa" w:w="1134"/>
+            <w:tcW w:type="dxa" w:w="1077"/>
             <w:vAlign w:val="top"/>
           </w:tcPr>
           <w:p>
@@ -3450,7 +3410,7 @@
         </w:tc>
         <w:tc>
           <w:tcPr>
-            <w:tcW w:type="dxa" w:w="1247"/>
+            <w:tcW w:type="dxa" w:w="1474"/>
             <w:vAlign w:val="top"/>
           </w:tcPr>
           <w:p>
@@ -3462,15 +3422,14 @@
               <w:rPr>
                 <w:b w:val="0"/>
                 <w:sz w:val="20"/>
-                <w:highlight w:val="yellow"/>
               </w:rPr>
-              <w:t>________</w:t>
+              <w:t>5,000,000</w:t>
             </w:r>
           </w:p>
         </w:tc>
         <w:tc>
           <w:tcPr>
-            <w:tcW w:type="dxa" w:w="1417"/>
+            <w:tcW w:type="dxa" w:w="1757"/>
             <w:vAlign w:val="top"/>
           </w:tcPr>
           <w:p>
@@ -3482,9 +3441,8 @@
               <w:rPr>
                 <w:b w:val="0"/>
                 <w:sz w:val="20"/>
-                <w:highlight w:val="yellow"/>
               </w:rPr>
-              <w:t>________</w:t>
+              <w:t>5,000,000</w:t>
             </w:r>
           </w:p>
         </w:tc>
@@ -3512,7 +3470,7 @@
         </w:tc>
         <w:tc>
           <w:tcPr>
-            <w:tcW w:type="dxa" w:w="3628"/>
+            <w:tcW w:type="dxa" w:w="3061"/>
             <w:vAlign w:val="top"/>
           </w:tcPr>
           <w:p>
@@ -3530,7 +3488,7 @@
         </w:tc>
         <w:tc>
           <w:tcPr>
-            <w:tcW w:type="dxa" w:w="1361"/>
+            <w:tcW w:type="dxa" w:w="1247"/>
             <w:vAlign w:val="top"/>
           </w:tcPr>
           <w:p>
@@ -3564,7 +3522,7 @@
         </w:tc>
         <w:tc>
           <w:tcPr>
-            <w:tcW w:type="dxa" w:w="1134"/>
+            <w:tcW w:type="dxa" w:w="1077"/>
             <w:vAlign w:val="top"/>
           </w:tcPr>
           <w:p>
@@ -3581,7 +3539,7 @@
         </w:tc>
         <w:tc>
           <w:tcPr>
-            <w:tcW w:type="dxa" w:w="1247"/>
+            <w:tcW w:type="dxa" w:w="1474"/>
             <w:vAlign w:val="top"/>
           </w:tcPr>
           <w:p>
@@ -3598,7 +3556,7 @@
         </w:tc>
         <w:tc>
           <w:tcPr>
-            <w:tcW w:type="dxa" w:w="1417"/>
+            <w:tcW w:type="dxa" w:w="1757"/>
             <w:vAlign w:val="top"/>
           </w:tcPr>
           <w:p>
@@ -3610,9 +3568,8 @@
               <w:rPr>
                 <w:b/>
                 <w:sz w:val="20"/>
-                <w:highlight w:val="yellow"/>
               </w:rPr>
-              <w:t>________</w:t>
+              <w:t>от 5,315,430,000</w:t>
             </w:r>
           </w:p>
         </w:tc>
@@ -3761,14 +3718,8 @@
     </w:p>
     <w:p>
       <w:pPr>
-        <w:spacing w:after="280" w:before="120"/>
+        <w:spacing w:after="160" w:before="0"/>
       </w:pPr>
-      <w:r>
-        <w:rPr>
-          <w:b w:val="0"/>
-        </w:rPr>
-        <w:t>Приложение: заполненная форма запроса ценового предложения (листы «Цены», «Условия», «Расчёт»).</w:t>
-      </w:r>
     </w:p>
     <w:p>
       <w:pPr>
@@ -3890,7 +3841,7 @@
             <a:graphicData uri="http://schemas.openxmlformats.org/drawingml/2006/picture">
               <pic:pic>
                 <pic:nvPicPr>
-                  <pic:cNvPr id="0" name="im-001.jpg"/>
+                  <pic:cNvPr id="0" name="onsite_logo.jpg"/>
                   <pic:cNvPicPr/>
                 </pic:nvPicPr>
                 <pic:blipFill>

</xml_diff>